<commit_message>
docs: ajustar la documentacion a las seis variables del catalogo
Se corrigen las enumeraciones del catalogo, las tablas de sensores y las frases que describian el registro manual del nivel de agua, en el README, las evidencias de la entrega, el glosario, el simulador, el guion de la demostracion y los documentos del prototipo.

En el prototipo se retira ademas el sensor ultrasonico del alcance: sale la fila de la tabla de correspondencia, la advertencia electrica de su pin Echo, la fila de la tabla de conexionado y la seccion de calibracion del nivel. La pieza queda como repuesto.

No se tocan las bitacoras ni los respaldos: son registros de lo que ocurrio cada dia, y en ellos el dato de entonces era correcto.
</commit_message>
<xml_diff>
--- a/docs/14_GLOSARIO_DE_CONCEPTOS.docx
+++ b/docs/14_GLOSARIO_DE_CONCEPTOS.docx
@@ -367,7 +367,7 @@
           <w:b w:val="0"/>
           <w:sz w:val="22"/>
         </w:rPr>
-        <w:t>En el proyecto: una de las siete variables; fuera de rango impide que la planta</w:t>
+        <w:t>En el proyecto: una de las seis variables; fuera de rango impide que la planta</w:t>
       </w:r>
     </w:p>
     <w:p>
@@ -3103,7 +3103,7 @@
           <w:b w:val="0"/>
           <w:sz w:val="22"/>
         </w:rPr>
-        <w:t>En el proyecto: un módulo piloto, 7 variables, 2 roles; sin control de</w:t>
+        <w:t>En el proyecto: un módulo piloto, 6 variables, 2 roles; sin control de</w:t>
       </w:r>
     </w:p>
     <w:p>

</xml_diff>

<commit_message>
docs(tablero): cuadrar el conteo de confirmaciones
El tablero declara 118 confirmaciones, que es el total del repositorio incluida esta actualizacion; los dias distintos siguen siendo trece. Se actualiza la misma cifra en el glosario y en el diccionario, que la citaban como 84 en diez fechas.
</commit_message>
<xml_diff>
--- a/docs/14_GLOSARIO_DE_CONCEPTOS.docx
+++ b/docs/14_GLOSARIO_DE_CONCEPTOS.docx
@@ -2941,7 +2941,7 @@
           <w:b w:val="0"/>
           <w:sz w:val="22"/>
         </w:rPr>
-        <w:t>En el proyecto: es el requisito mínimo 5: 84 confirmaciones en 10 fechas.</w:t>
+        <w:t>En el proyecto: es el requisito mínimo 5: 118 confirmaciones en 13 fechas.</w:t>
       </w:r>
     </w:p>
     <w:p>
@@ -3721,7 +3721,7 @@
                 <w:b w:val="0"/>
                 <w:sz w:val="20"/>
               </w:rPr>
-              <w:t>84 en 10 fechas</w:t>
+              <w:t>118 en 13 fechas</w:t>
             </w:r>
           </w:p>
         </w:tc>

</xml_diff>

<commit_message>
docs(e2): actualizar el catalogo a seis variables en el entregable
El documento heredaba del E1 las formulas RF-04 y RF-11, que declaraban un catalogo de siete variables, y la descripcion del campo variable del diccionario, que enumeraba la retirada. Se corrige sobre el documento ya maquetado, sin reconstruirlo, para conservar el ajuste de ancho de columna que el autor hizo en Word. La figura del modelo de datos se sustituye por la nueva.

Se cuadra ademas el conteo de confirmaciones a 119 en el tablero, el glosario y el diccionario.
</commit_message>
<xml_diff>
--- a/docs/14_GLOSARIO_DE_CONCEPTOS.docx
+++ b/docs/14_GLOSARIO_DE_CONCEPTOS.docx
@@ -2941,7 +2941,7 @@
           <w:b w:val="0"/>
           <w:sz w:val="22"/>
         </w:rPr>
-        <w:t>En el proyecto: es el requisito mínimo 5: 118 confirmaciones en 13 fechas.</w:t>
+        <w:t>En el proyecto: es el requisito mínimo 5: 119 confirmaciones en 13 fechas.</w:t>
       </w:r>
     </w:p>
     <w:p>
@@ -3721,7 +3721,7 @@
                 <w:b w:val="0"/>
                 <w:sz w:val="20"/>
               </w:rPr>
-              <w:t>118 en 13 fechas</w:t>
+              <w:t>119 en 13 fechas</w:t>
             </w:r>
           </w:p>
         </w:tc>

</xml_diff>

<commit_message>
docs(e2): sustituir la figura del modelo de datos y completar el campo unidad
La figura se redibuja con una barra de titulo en color solido y el cuerpo en tono claro, con un color propio por coleccion, los rotulos de cada relacion al costado del trazo y flechas mas visibles. Se anade el campo unidad de la coleccion alertas, que el diccionario declara y la figura omitia.

Las dos tablas del diccionario que declaraban un catalogo de siete variables pasan a seis, de modo que regenerar el documento no reintroduzca el numero anterior.

Se cuadra el conteo de confirmaciones a 120 en el tablero, el glosario y el diccionario.
</commit_message>
<xml_diff>
--- a/docs/14_GLOSARIO_DE_CONCEPTOS.docx
+++ b/docs/14_GLOSARIO_DE_CONCEPTOS.docx
@@ -2941,7 +2941,7 @@
           <w:b w:val="0"/>
           <w:sz w:val="22"/>
         </w:rPr>
-        <w:t>En el proyecto: es el requisito mínimo 5: 119 confirmaciones en 13 fechas.</w:t>
+        <w:t>En el proyecto: es el requisito mínimo 5: 120 confirmaciones en 13 fechas.</w:t>
       </w:r>
     </w:p>
     <w:p>
@@ -3721,7 +3721,7 @@
                 <w:b w:val="0"/>
                 <w:sz w:val="20"/>
               </w:rPr>
-              <w:t>119 en 13 fechas</w:t>
+              <w:t>120 en 13 fechas</w:t>
             </w:r>
           </w:p>
         </w:tc>

</xml_diff>

<commit_message>
docs(e2): insertar la figura del modelo de datos del autor y poner las figuras en su sitio
La figura del modelo de datos pasa a ser la que dibujo el autor, con los cuatro rotulos «null» que la herramienta habia dejado en el fondo y que se limpiaron antes de insertarla.

Se corrigen ademas dos defectos de maqueta heredados del E1: las cuatro figuras anchas se mostraban a 16 o 17 cm cuando el ancho util es de 14,59 —se metian entre 1,6 y 2,4 cm en el margen derecho—, y varias no conservaban la proporcion de su archivo (la de arquitectura aplastada un 7 % y los dos bocetos estirados un 8 %). Ahora ninguna se deforma y todas entran en el ancho de la pagina. La figura de casos de uso no se toco porque es un grupo flotante con cuadros de texto dentro.

Se cuadra el conteo de confirmaciones a 121 en el tablero, el glosario y el diccionario.
</commit_message>
<xml_diff>
--- a/docs/14_GLOSARIO_DE_CONCEPTOS.docx
+++ b/docs/14_GLOSARIO_DE_CONCEPTOS.docx
@@ -2941,7 +2941,7 @@
           <w:b w:val="0"/>
           <w:sz w:val="22"/>
         </w:rPr>
-        <w:t>En el proyecto: es el requisito mínimo 5: 120 confirmaciones en 13 fechas.</w:t>
+        <w:t>En el proyecto: es el requisito mínimo 5: 121 confirmaciones en 13 fechas.</w:t>
       </w:r>
     </w:p>
     <w:p>
@@ -3721,7 +3721,7 @@
                 <w:b w:val="0"/>
                 <w:sz w:val="20"/>
               </w:rPr>
-              <w:t>120 en 13 fechas</w:t>
+              <w:t>121 en 13 fechas</w:t>
             </w:r>
           </w:p>
         </w:tc>

</xml_diff>

<commit_message>
fix(e2): quitar del entregable las frases que quedaban de la variable retirada
El apartado 2.6.1 decia que el nivel de agua se registra de forma manual y el 2.6.5 lo anunciaba como pendiente, cuando esa variable salio del sistema el 25 de septiembre. La introduccion tambien lo enumeraba entre las variables del cultivo. Se corrigen los tres textos en el documento y en el generador, para que una regeneracion no los reintroduzca.

Se restaura ademas un guion largo de apertura que se habia perdido al editar la descripcion del metodo y dejaba un guion de cierre huerfano.

Se cuadra el conteo de confirmaciones a 122 en el tablero, el glosario y el diccionario.
</commit_message>
<xml_diff>
--- a/docs/14_GLOSARIO_DE_CONCEPTOS.docx
+++ b/docs/14_GLOSARIO_DE_CONCEPTOS.docx
@@ -2941,7 +2941,7 @@
           <w:b w:val="0"/>
           <w:sz w:val="22"/>
         </w:rPr>
-        <w:t>En el proyecto: es el requisito mínimo 5: 121 confirmaciones en 13 fechas.</w:t>
+        <w:t>En el proyecto: es el requisito mínimo 5: 122 confirmaciones en 13 fechas.</w:t>
       </w:r>
     </w:p>
     <w:p>
@@ -3721,7 +3721,7 @@
                 <w:b w:val="0"/>
                 <w:sz w:val="20"/>
               </w:rPr>
-              <w:t>121 en 13 fechas</w:t>
+              <w:t>122 en 13 fechas</w:t>
             </w:r>
           </w:p>
         </w:tc>

</xml_diff>

<commit_message>
fix(e2): que los titulos viajen con su contenido
Los tres estilos de titulo estaban sin la propiedad «mantener con el siguiente», y ningun parrafo del cuerpo la tenia: un encabezado podia quedar solo al pie de una pagina mientras su figura saltaba a la siguiente. Ocurria en el apartado 2.4.2, donde el titulo «Modelo de datos» cerraba la pagina 27 y la figura abria la 28, dejando media pagina vacia. Ahora el titulo cae en la 28 junto con su figura, y el documento sigue en 48 paginas.

Se cuadra el conteo de confirmaciones a 124 en el tablero, el glosario y el diccionario.
</commit_message>
<xml_diff>
--- a/docs/14_GLOSARIO_DE_CONCEPTOS.docx
+++ b/docs/14_GLOSARIO_DE_CONCEPTOS.docx
@@ -2941,7 +2941,7 @@
           <w:b w:val="0"/>
           <w:sz w:val="22"/>
         </w:rPr>
-        <w:t>En el proyecto: es el requisito mínimo 5: 123 confirmaciones en 13 fechas.</w:t>
+        <w:t>En el proyecto: es el requisito mínimo 5: 124 confirmaciones en 13 fechas.</w:t>
       </w:r>
     </w:p>
     <w:p>
@@ -3721,7 +3721,7 @@
                 <w:b w:val="0"/>
                 <w:sz w:val="20"/>
               </w:rPr>
-              <w:t>123 en 13 fechas</w:t>
+              <w:t>124 en 13 fechas</w:t>
             </w:r>
           </w:p>
         </w:tc>

</xml_diff>

<commit_message>
fix(e2): poner en su sitio la figura de casos de uso
Esa figura no es una imagen suelta sino un grupo de Word con la imagen como relleno de una forma y dos cuadros de texto para el pie. Se mostraba a 16,99 x 14,43 cm mientras su espacio interno es de 17,08 x 12,98: el factor horizontal era 0,995 y el vertical 1,112, y esa diferencia la estiraba un 12 % y la metia 2,4 cm en el margen derecho.

Se le devuelve una escala uniforme: el tamano visible se calcula multiplicando su espacio interno por el factor que lo lleva al ancho util, de modo que entra en el margen y recupera su proporcion sin tocar ninguna de las formas, los cuadros de texto ni la imagen de su interior. Las seis figuras del documento quedan ahora dentro del ancho de la pagina.

Se cuadra el conteo de confirmaciones a 125 en el tablero, el glosario y el diccionario.
</commit_message>
<xml_diff>
--- a/docs/14_GLOSARIO_DE_CONCEPTOS.docx
+++ b/docs/14_GLOSARIO_DE_CONCEPTOS.docx
@@ -2941,7 +2941,7 @@
           <w:b w:val="0"/>
           <w:sz w:val="22"/>
         </w:rPr>
-        <w:t>En el proyecto: es el requisito mínimo 5: 124 confirmaciones en 13 fechas.</w:t>
+        <w:t>En el proyecto: es el requisito mínimo 5: 125 confirmaciones en 13 fechas.</w:t>
       </w:r>
     </w:p>
     <w:p>
@@ -3721,7 +3721,7 @@
                 <w:b w:val="0"/>
                 <w:sz w:val="20"/>
               </w:rPr>
-              <w:t>124 en 13 fechas</w:t>
+              <w:t>125 en 13 fechas</w:t>
             </w:r>
           </w:p>
         </w:tc>

</xml_diff>